<commit_message>
Add 65° Walker delta finding to the proposal
The simulation shows the same 30 satellites in a 65° Walker delta instead
of sun-synchronous planes cut the worst North Sea coverage gap from 118 to
3 min. Added to the Constellation paragraph in md/html/docx/doc/pdf. To keep
the PDF at 2 pages, shortened the store-and-forward clause and abbreviated
"ITU Radio Regulations" to "ITU RR". Previous version saved as history/v7.

Co-Authored-By: Claude Opus 5.5 <noreply@anthropic.com>
</commit_message>
<xml_diff>
--- a/03-proposal/current/final.docx
+++ b/03-proposal/current/final.docx
@@ -1048,7 +1048,7 @@
           <w:sz w:val="20"/>
           <w:szCs w:val="20"/>
         </w:rPr>
-        <w:t xml:space="preserve"> across, so one satellite in view covers the whole basin and every land gateway around it. Twelve satellites give frequent passes, not continuous coverage: alarms go out on the next pass and store-and-forward carries bulk data between passes. At a 5-year life, a 30-satellite fleet needs </w:t>
+        <w:t xml:space="preserve"> across, so one satellite in view covers the whole basin and every land gateway around it. Twelve satellites give frequent passes, not continuous coverage: alarms go out on the next pass, bulk data by store-and-forward. At a 5-year life, a 30-satellite fleet needs </w:t>
       </w:r>
       <w:r>
         <w:rPr>
@@ -1066,7 +1066,79 @@
           <w:sz w:val="20"/>
           <w:szCs w:val="20"/>
         </w:rPr>
-        <w:t xml:space="preserve"> replacements per year. Scaling to OQ's planned 30 (e.g., 3 planes × 10) shrinks gaps between passes about 2.5× and lets each plane close an RF inter-satellite ring; the same policies then add mesh relaying and extend to the Norwegian Sea and Atlantic, on the way to OQ's 100 D2D payloads.</w:t>
+        <w:t xml:space="preserve"> replacements per year. Scaling to OQ's planned </w:t>
+      </w:r>
+      <w:r>
+        <w:rPr>
+          <w:rFonts w:ascii="JetBrains Mono" w:cs="JetBrains Mono" w:eastAsia="JetBrains Mono" w:hAnsi="JetBrains Mono"/>
+          <w:color w:val="B45F12"/>
+          <w:sz w:val="20"/>
+          <w:szCs w:val="20"/>
+        </w:rPr>
+        <w:t xml:space="preserve">30</w:t>
+      </w:r>
+      <w:r>
+        <w:rPr>
+          <w:rFonts w:ascii="Arial" w:cs="Arial" w:eastAsia="Arial" w:hAnsi="Arial"/>
+          <w:color w:val="0E0E0E"/>
+          <w:sz w:val="20"/>
+          <w:szCs w:val="20"/>
+        </w:rPr>
+        <w:t xml:space="preserve"> (3 planes × 10) shrinks gaps about 2.5× and lets each plane close an RF inter-satellite ring; in our twin, a </w:t>
+      </w:r>
+      <w:r>
+        <w:rPr>
+          <w:rFonts w:ascii="JetBrains Mono" w:cs="JetBrains Mono" w:eastAsia="JetBrains Mono" w:hAnsi="JetBrains Mono"/>
+          <w:color w:val="B45F12"/>
+          <w:sz w:val="20"/>
+          <w:szCs w:val="20"/>
+        </w:rPr>
+        <w:t xml:space="preserve">65°</w:t>
+      </w:r>
+      <w:r>
+        <w:rPr>
+          <w:rFonts w:ascii="Arial" w:cs="Arial" w:eastAsia="Arial" w:hAnsi="Arial"/>
+          <w:color w:val="0E0E0E"/>
+          <w:sz w:val="20"/>
+          <w:szCs w:val="20"/>
+        </w:rPr>
+        <w:t xml:space="preserve"> Walker delta instead of sun-synchronous planes cuts the worst North Sea gap from </w:t>
+      </w:r>
+      <w:r>
+        <w:rPr>
+          <w:rFonts w:ascii="JetBrains Mono" w:cs="JetBrains Mono" w:eastAsia="JetBrains Mono" w:hAnsi="JetBrains Mono"/>
+          <w:color w:val="B45F12"/>
+          <w:sz w:val="20"/>
+          <w:szCs w:val="20"/>
+        </w:rPr>
+        <w:t xml:space="preserve">118</w:t>
+      </w:r>
+      <w:r>
+        <w:rPr>
+          <w:rFonts w:ascii="Arial" w:cs="Arial" w:eastAsia="Arial" w:hAnsi="Arial"/>
+          <w:color w:val="0E0E0E"/>
+          <w:sz w:val="20"/>
+          <w:szCs w:val="20"/>
+        </w:rPr>
+        <w:t xml:space="preserve"> to </w:t>
+      </w:r>
+      <w:r>
+        <w:rPr>
+          <w:rFonts w:ascii="JetBrains Mono" w:cs="JetBrains Mono" w:eastAsia="JetBrains Mono" w:hAnsi="JetBrains Mono"/>
+          <w:color w:val="B45F12"/>
+          <w:sz w:val="20"/>
+          <w:szCs w:val="20"/>
+        </w:rPr>
+        <w:t xml:space="preserve">3 min</w:t>
+      </w:r>
+      <w:r>
+        <w:rPr>
+          <w:rFonts w:ascii="Arial" w:cs="Arial" w:eastAsia="Arial" w:hAnsi="Arial"/>
+          <w:color w:val="0E0E0E"/>
+          <w:sz w:val="20"/>
+          <w:szCs w:val="20"/>
+        </w:rPr>
+        <w:t xml:space="preserve">. The same policies then add mesh relaying and extend to the Norwegian Sea and Atlantic, on the way to OQ's 100 D2D payloads.</w:t>
       </w:r>
     </w:p>
     <w:p>
@@ -1296,7 +1368,7 @@
           <w:sz w:val="20"/>
           <w:szCs w:val="20"/>
         </w:rPr>
-        <w:t xml:space="preserve">Compliance treats ITU Radio Regulations Article 9 coordination and Article 22 EPFD limits as hard design constraints (feeder-link masks, gateway exclusion zones), with applicable PFD/EIRP conditions and national authorisations. It supports EU-hosted processing, encryption, key ownership, pseudonymisation and GDPR retention. </w:t>
+        <w:t xml:space="preserve">Compliance treats ITU RR Article 9 coordination and Article 22 EPFD limits as hard design constraints (feeder-link masks, gateway exclusion zones), with PFD/EIRP conditions and national authorisations. It supports EU-hosted processing, encryption, key ownership, pseudonymisation and GDPR retention. </w:t>
       </w:r>
       <w:r>
         <w:rPr>
@@ -2389,6 +2461,21 @@
   <w:style w:type="paragraph" w:styleId="Normal" w:default="1">
     <w:name w:val="Normal"/>
     <w:qFormat/>
+  </w:style>
+  <w:style w:type="table" w:styleId="TableNormal" w:default="true">
+    <w:name w:val="Normal Table"/>
+    <w:uiPriority w:val="99"/>
+    <w:semiHidden/>
+    <w:unhideWhenUsed/>
+    <w:tblPr>
+      <w:tblInd w:type="dxa" w:w="0"/>
+      <w:tblCellMar>
+        <w:top w:type="dxa" w:w="0"/>
+        <w:left w:type="dxa" w:w="108"/>
+        <w:bottom w:type="dxa" w:w="0"/>
+        <w:right w:type="dxa" w:w="108"/>
+      </w:tblCellMar>
+    </w:tblPr>
   </w:style>
   <w:style w:type="paragraph" w:styleId="Title">
     <w:name w:val="Title"/>

</xml_diff>